<commit_message>
Use hyphens instead of em dashes throughout
Applies to the README, the report in both formats, the response templates, the
UI copy and the source comments. Model tokenizer vocabularies and build output
are untouched.
</commit_message>
<xml_diff>
--- a/report/VoiceBot-Report.docx
+++ b/report/VoiceBot-Report.docx
@@ -28,7 +28,7 @@
           <w:sz w:val="22"/>
           <w:szCs w:val="22"/>
         </w:rPr>
-        <w:t xml:space="preserve">Speech and Language Processing — Lab Assessment</w:t>
+        <w:t xml:space="preserve">Speech and Language Processing - Lab Assessment</w:t>
       </w:r>
     </w:p>
     <w:tbl>
@@ -343,7 +343,7 @@
           <w:sz w:val="22"/>
           <w:szCs w:val="22"/>
         </w:rPr>
-        <w:t xml:space="preserve">The classifier is trained on CLINC150 (Larson et al., EMNLP 2019), a benchmark created specifically for intent classification. It contains 150 in-scope intents across ten domains with 150 crowdsourced utterances each, and — unusually for an intent dataset — an explicit out-of-scope class of queries a task-oriented assistant is not built to answer.</w:t>
+        <w:t xml:space="preserve">The classifier is trained on CLINC150 (Larson et al., EMNLP 2019), a benchmark created specifically for intent classification. It contains 150 in-scope intents across ten domains with 150 crowdsourced utterances each, and - unusually for an intent dataset - an explicit out-of-scope class of queries a task-oriented assistant is not built to answer.</w:t>
       </w:r>
     </w:p>
     <w:p>
@@ -2490,7 +2490,7 @@
                 <w:sz w:val="20"/>
                 <w:szCs w:val="20"/>
               </w:rPr>
-              <w:t xml:space="preserve">—</w:t>
+              <w:t xml:space="preserve">-</w:t>
             </w:r>
           </w:p>
         </w:tc>

</xml_diff>